<commit_message>
Handson5 - Task 2: State with useState and Dynamic Lists  Completed
</commit_message>
<xml_diff>
--- a/Frontend Development/handson_05/handon5.docx
+++ b/Frontend Development/handson_05/handon5.docx
@@ -237,9 +237,10 @@
         <w:pBdr/>
         <w:spacing/>
         <w:ind/>
-        <w:rPr/>
-      </w:pPr>
-      <w:r/>
+        <w:rPr>
+          <w:highlight w:val="none"/>
+        </w:rPr>
+      </w:pPr>
       <w:r>
         <mc:AlternateContent>
           <mc:Choice Requires="wpg">
@@ -310,7 +311,534 @@
         </mc:AlternateContent>
       </w:r>
       <w:r/>
-      <w:r/>
+    </w:p>
+    <w:p>
+      <w:pPr>
+        <w:pBdr/>
+        <w:spacing/>
+        <w:ind/>
+        <w:rPr>
+          <w:u w:val="single"/>
+        </w:rPr>
+      </w:pPr>
+      <w:r>
+        <w:rPr>
+          <w:u w:val="single"/>
+        </w:rPr>
+      </w:r>
+      <w:r>
+        <w:rPr>
+          <w:u w:val="single"/>
+        </w:rPr>
+      </w:r>
+      <w:r>
+        <w:rPr>
+          <w:u w:val="single"/>
+        </w:rPr>
+      </w:r>
+    </w:p>
+    <w:p>
+      <w:pPr>
+        <w:pBdr/>
+        <w:spacing/>
+        <w:ind/>
+        <w:rPr>
+          <w:highlight w:val="none"/>
+          <w:u w:val="single"/>
+        </w:rPr>
+      </w:pPr>
+      <w:r>
+        <w:rPr>
+          <w:highlight w:val="none"/>
+          <w:u w:val="single"/>
+        </w:rPr>
+        <w:t xml:space="preserve">T</w:t>
+      </w:r>
+      <w:r>
+        <w:rPr>
+          <w:highlight w:val="none"/>
+          <w:u w:val="single"/>
+        </w:rPr>
+        <w:t xml:space="preserve">ask 2: State with useState and Dynamic Lists</w:t>
+      </w:r>
+      <w:r>
+        <w:rPr>
+          <w:highlight w:val="none"/>
+          <w:u w:val="single"/>
+        </w:rPr>
+      </w:r>
+      <w:r>
+        <w:rPr>
+          <w:u w:val="single"/>
+        </w:rPr>
+      </w:r>
+    </w:p>
+    <w:p>
+      <w:pPr>
+        <w:pBdr/>
+        <w:spacing/>
+        <w:ind/>
+        <w:rPr>
+          <w:u w:val="single"/>
+        </w:rPr>
+      </w:pPr>
+      <w:r>
+        <w:rPr>
+          <w:u w:val="single"/>
+        </w:rPr>
+      </w:r>
+      <w:r>
+        <w:rPr>
+          <w:u w:val="single"/>
+        </w:rPr>
+      </w:r>
+      <w:r>
+        <w:rPr>
+          <w:u w:val="single"/>
+        </w:rPr>
+      </w:r>
+    </w:p>
+    <w:p>
+      <w:pPr>
+        <w:pBdr/>
+        <w:spacing/>
+        <w:ind/>
+        <w:rPr>
+          <w:highlight w:val="none"/>
+          <w:u w:val="single"/>
+        </w:rPr>
+      </w:pPr>
+      <w:r>
+        <w:rPr>
+          <w:highlight w:val="none"/>
+          <w:u w:val="single"/>
+        </w:rPr>
+      </w:r>
+      <w:r>
+        <mc:AlternateContent>
+          <mc:Choice Requires="wpg">
+            <w:drawing>
+              <wp:inline xmlns:wp="http://schemas.openxmlformats.org/drawingml/2006/wordprocessingDrawing" distT="0" distB="0" distL="0" distR="0">
+                <wp:extent cx="5943600" cy="3030617"/>
+                <wp:effectExtent l="0" t="0" r="0" b="0"/>
+                <wp:docPr id="3" name=""/>
+                <wp:cNvGraphicFramePr>
+                  <a:graphicFrameLocks xmlns:a="http://schemas.openxmlformats.org/drawingml/2006/main" noChangeAspect="1"/>
+                </wp:cNvGraphicFramePr>
+                <a:graphic xmlns:a="http://schemas.openxmlformats.org/drawingml/2006/main">
+                  <a:graphicData uri="http://schemas.openxmlformats.org/drawingml/2006/picture">
+                    <pic:pic xmlns:pic="http://schemas.openxmlformats.org/drawingml/2006/picture">
+                      <pic:nvPicPr>
+                        <pic:cNvPr id="1191720804" name=""/>
+                        <pic:cNvPicPr>
+                          <a:picLocks noChangeAspect="1"/>
+                        </pic:cNvPicPr>
+                        <pic:nvPr/>
+                      </pic:nvPicPr>
+                      <pic:blipFill rotWithShape="1">
+                        <a:blip r:embed="rId9"/>
+                        <a:stretch/>
+                      </pic:blipFill>
+                      <pic:spPr bwMode="auto">
+                        <a:xfrm>
+                          <a:off x="0" y="0"/>
+                          <a:ext cx="5943599" cy="3030616"/>
+                        </a:xfrm>
+                        <a:prstGeom prst="rect">
+                          <a:avLst/>
+                        </a:prstGeom>
+                      </pic:spPr>
+                    </pic:pic>
+                  </a:graphicData>
+                </a:graphic>
+              </wp:inline>
+            </w:drawing>
+          </mc:Choice>
+          <mc:Fallback>
+            <w:pict>
+              <v:shapetype id="_x0000_t75" coordsize="21600,21600" o:spt="75" o:preferrelative="t" path="m@4@5l@4@11@9@11@9@5xe" filled="f" stroked="f">
+                <v:stroke joinstyle="miter"/>
+                <v:formulas>
+                  <v:f eqn="if lineDrawn pixelLineWidth 0"/>
+                  <v:f eqn="sum @0 1 0"/>
+                  <v:f eqn="sum 0 0 @1"/>
+                  <v:f eqn="prod @2 1 2"/>
+                  <v:f eqn="prod @3 21600 pixelWidth"/>
+                  <v:f eqn="prod @3 21600 pixelHeight"/>
+                  <v:f eqn="sum @0 0 1"/>
+                  <v:f eqn="prod @6 1 2"/>
+                  <v:f eqn="prod @7 21600 pixelWidth"/>
+                  <v:f eqn="sum @8 21600 0"/>
+                  <v:f eqn="prod @7 21600 pixelHeight"/>
+                  <v:f eqn="sum @10 21600 0"/>
+                </v:formulas>
+                <v:path o:extrusionok="f" gradientshapeok="t" o:connecttype="rect"/>
+                <o:lock v:ext="edit" aspectratio="t"/>
+              </v:shapetype>
+              <v:shape id="_x0000_i2" o:spid="_x0000_s2" type="#_x0000_t75" style="width:468.00pt;height:238.63pt;mso-wrap-distance-left:0.00pt;mso-wrap-distance-top:0.00pt;mso-wrap-distance-right:0.00pt;mso-wrap-distance-bottom:0.00pt;z-index:1;" stroked="false">
+                <v:imagedata r:id="rId9" o:title=""/>
+                <o:lock v:ext="edit" rotation="t"/>
+              </v:shape>
+            </w:pict>
+          </mc:Fallback>
+        </mc:AlternateContent>
+      </w:r>
+      <w:r>
+        <w:rPr>
+          <w:highlight w:val="none"/>
+          <w:u w:val="single"/>
+        </w:rPr>
+      </w:r>
+      <w:r>
+        <w:rPr>
+          <w:highlight w:val="none"/>
+          <w:u w:val="single"/>
+        </w:rPr>
+      </w:r>
+      <w:r>
+        <w:rPr>
+          <w:u w:val="single"/>
+        </w:rPr>
+      </w:r>
+    </w:p>
+    <w:p>
+      <w:pPr>
+        <w:pBdr/>
+        <w:spacing/>
+        <w:ind/>
+        <w:rPr>
+          <w:highlight w:val="none"/>
+          <w:u w:val="single"/>
+        </w:rPr>
+      </w:pPr>
+      <w:r>
+        <w:rPr>
+          <w:highlight w:val="none"/>
+          <w:u w:val="single"/>
+        </w:rPr>
+      </w:r>
+      <w:r>
+        <mc:AlternateContent>
+          <mc:Choice Requires="wpg">
+            <w:drawing>
+              <wp:inline xmlns:wp="http://schemas.openxmlformats.org/drawingml/2006/wordprocessingDrawing" distT="0" distB="0" distL="0" distR="0">
+                <wp:extent cx="5943600" cy="3030617"/>
+                <wp:effectExtent l="0" t="0" r="0" b="0"/>
+                <wp:docPr id="4" name=""/>
+                <wp:cNvGraphicFramePr>
+                  <a:graphicFrameLocks xmlns:a="http://schemas.openxmlformats.org/drawingml/2006/main" noChangeAspect="1"/>
+                </wp:cNvGraphicFramePr>
+                <a:graphic xmlns:a="http://schemas.openxmlformats.org/drawingml/2006/main">
+                  <a:graphicData uri="http://schemas.openxmlformats.org/drawingml/2006/picture">
+                    <pic:pic xmlns:pic="http://schemas.openxmlformats.org/drawingml/2006/picture">
+                      <pic:nvPicPr>
+                        <pic:cNvPr id="1829912002" name=""/>
+                        <pic:cNvPicPr>
+                          <a:picLocks noChangeAspect="1"/>
+                        </pic:cNvPicPr>
+                        <pic:nvPr/>
+                      </pic:nvPicPr>
+                      <pic:blipFill rotWithShape="1">
+                        <a:blip r:embed="rId10"/>
+                        <a:stretch/>
+                      </pic:blipFill>
+                      <pic:spPr bwMode="auto">
+                        <a:xfrm>
+                          <a:off x="0" y="0"/>
+                          <a:ext cx="5943599" cy="3030616"/>
+                        </a:xfrm>
+                        <a:prstGeom prst="rect">
+                          <a:avLst/>
+                        </a:prstGeom>
+                      </pic:spPr>
+                    </pic:pic>
+                  </a:graphicData>
+                </a:graphic>
+              </wp:inline>
+            </w:drawing>
+          </mc:Choice>
+          <mc:Fallback>
+            <w:pict>
+              <v:shapetype id="_x0000_t75" coordsize="21600,21600" o:spt="75" o:preferrelative="t" path="m@4@5l@4@11@9@11@9@5xe" filled="f" stroked="f">
+                <v:stroke joinstyle="miter"/>
+                <v:formulas>
+                  <v:f eqn="if lineDrawn pixelLineWidth 0"/>
+                  <v:f eqn="sum @0 1 0"/>
+                  <v:f eqn="sum 0 0 @1"/>
+                  <v:f eqn="prod @2 1 2"/>
+                  <v:f eqn="prod @3 21600 pixelWidth"/>
+                  <v:f eqn="prod @3 21600 pixelHeight"/>
+                  <v:f eqn="sum @0 0 1"/>
+                  <v:f eqn="prod @6 1 2"/>
+                  <v:f eqn="prod @7 21600 pixelWidth"/>
+                  <v:f eqn="sum @8 21600 0"/>
+                  <v:f eqn="prod @7 21600 pixelHeight"/>
+                  <v:f eqn="sum @10 21600 0"/>
+                </v:formulas>
+                <v:path o:extrusionok="f" gradientshapeok="t" o:connecttype="rect"/>
+                <o:lock v:ext="edit" aspectratio="t"/>
+              </v:shapetype>
+              <v:shape id="_x0000_i3" o:spid="_x0000_s3" type="#_x0000_t75" style="width:468.00pt;height:238.63pt;mso-wrap-distance-left:0.00pt;mso-wrap-distance-top:0.00pt;mso-wrap-distance-right:0.00pt;mso-wrap-distance-bottom:0.00pt;z-index:1;" stroked="false">
+                <v:imagedata r:id="rId10" o:title=""/>
+                <o:lock v:ext="edit" rotation="t"/>
+              </v:shape>
+            </w:pict>
+          </mc:Fallback>
+        </mc:AlternateContent>
+      </w:r>
+      <w:r>
+        <w:rPr>
+          <w:highlight w:val="none"/>
+          <w:u w:val="single"/>
+        </w:rPr>
+      </w:r>
+      <w:r>
+        <w:rPr>
+          <w:highlight w:val="none"/>
+          <w:u w:val="single"/>
+        </w:rPr>
+      </w:r>
+      <w:r>
+        <w:rPr>
+          <w:highlight w:val="none"/>
+          <w:u w:val="single"/>
+        </w:rPr>
+      </w:r>
+    </w:p>
+    <w:p>
+      <w:pPr>
+        <w:pBdr/>
+        <w:spacing/>
+        <w:ind/>
+        <w:rPr>
+          <w:highlight w:val="none"/>
+          <w:u w:val="single"/>
+        </w:rPr>
+      </w:pPr>
+      <w:r>
+        <w:rPr>
+          <w:highlight w:val="none"/>
+          <w:u w:val="single"/>
+        </w:rPr>
+      </w:r>
+      <w:r>
+        <mc:AlternateContent>
+          <mc:Choice Requires="wpg">
+            <w:drawing>
+              <wp:inline xmlns:wp="http://schemas.openxmlformats.org/drawingml/2006/wordprocessingDrawing" distT="0" distB="0" distL="0" distR="0">
+                <wp:extent cx="5943600" cy="3030617"/>
+                <wp:effectExtent l="0" t="0" r="0" b="0"/>
+                <wp:docPr id="5" name=""/>
+                <wp:cNvGraphicFramePr>
+                  <a:graphicFrameLocks xmlns:a="http://schemas.openxmlformats.org/drawingml/2006/main" noChangeAspect="1"/>
+                </wp:cNvGraphicFramePr>
+                <a:graphic xmlns:a="http://schemas.openxmlformats.org/drawingml/2006/main">
+                  <a:graphicData uri="http://schemas.openxmlformats.org/drawingml/2006/picture">
+                    <pic:pic xmlns:pic="http://schemas.openxmlformats.org/drawingml/2006/picture">
+                      <pic:nvPicPr>
+                        <pic:cNvPr id="2052219194" name=""/>
+                        <pic:cNvPicPr>
+                          <a:picLocks noChangeAspect="1"/>
+                        </pic:cNvPicPr>
+                        <pic:nvPr/>
+                      </pic:nvPicPr>
+                      <pic:blipFill rotWithShape="1">
+                        <a:blip r:embed="rId11"/>
+                        <a:stretch/>
+                      </pic:blipFill>
+                      <pic:spPr bwMode="auto">
+                        <a:xfrm>
+                          <a:off x="0" y="0"/>
+                          <a:ext cx="5943599" cy="3030616"/>
+                        </a:xfrm>
+                        <a:prstGeom prst="rect">
+                          <a:avLst/>
+                        </a:prstGeom>
+                      </pic:spPr>
+                    </pic:pic>
+                  </a:graphicData>
+                </a:graphic>
+              </wp:inline>
+            </w:drawing>
+          </mc:Choice>
+          <mc:Fallback>
+            <w:pict>
+              <v:shapetype id="_x0000_t75" coordsize="21600,21600" o:spt="75" o:preferrelative="t" path="m@4@5l@4@11@9@11@9@5xe" filled="f" stroked="f">
+                <v:stroke joinstyle="miter"/>
+                <v:formulas>
+                  <v:f eqn="if lineDrawn pixelLineWidth 0"/>
+                  <v:f eqn="sum @0 1 0"/>
+                  <v:f eqn="sum 0 0 @1"/>
+                  <v:f eqn="prod @2 1 2"/>
+                  <v:f eqn="prod @3 21600 pixelWidth"/>
+                  <v:f eqn="prod @3 21600 pixelHeight"/>
+                  <v:f eqn="sum @0 0 1"/>
+                  <v:f eqn="prod @6 1 2"/>
+                  <v:f eqn="prod @7 21600 pixelWidth"/>
+                  <v:f eqn="sum @8 21600 0"/>
+                  <v:f eqn="prod @7 21600 pixelHeight"/>
+                  <v:f eqn="sum @10 21600 0"/>
+                </v:formulas>
+                <v:path o:extrusionok="f" gradientshapeok="t" o:connecttype="rect"/>
+                <o:lock v:ext="edit" aspectratio="t"/>
+              </v:shapetype>
+              <v:shape id="_x0000_i4" o:spid="_x0000_s4" type="#_x0000_t75" style="width:468.00pt;height:238.63pt;mso-wrap-distance-left:0.00pt;mso-wrap-distance-top:0.00pt;mso-wrap-distance-right:0.00pt;mso-wrap-distance-bottom:0.00pt;z-index:1;" stroked="false">
+                <v:imagedata r:id="rId11" o:title=""/>
+                <o:lock v:ext="edit" rotation="t"/>
+              </v:shape>
+            </w:pict>
+          </mc:Fallback>
+        </mc:AlternateContent>
+      </w:r>
+      <w:r>
+        <w:rPr>
+          <w:highlight w:val="none"/>
+          <w:u w:val="single"/>
+        </w:rPr>
+      </w:r>
+      <w:r>
+        <w:rPr>
+          <w:highlight w:val="none"/>
+          <w:u w:val="single"/>
+        </w:rPr>
+      </w:r>
+      <w:r>
+        <w:rPr>
+          <w:highlight w:val="none"/>
+          <w:u w:val="single"/>
+        </w:rPr>
+      </w:r>
+    </w:p>
+    <w:p>
+      <w:pPr>
+        <w:pBdr/>
+        <w:spacing/>
+        <w:ind/>
+        <w:rPr>
+          <w:highlight w:val="none"/>
+          <w:u w:val="single"/>
+        </w:rPr>
+      </w:pPr>
+      <w:r>
+        <w:rPr>
+          <w:highlight w:val="none"/>
+          <w:u w:val="single"/>
+        </w:rPr>
+      </w:r>
+      <w:r>
+        <w:rPr>
+          <w:highlight w:val="none"/>
+          <w:u w:val="single"/>
+        </w:rPr>
+      </w:r>
+      <w:r>
+        <mc:AlternateContent>
+          <mc:Choice Requires="wpg">
+            <w:drawing>
+              <wp:inline xmlns:wp="http://schemas.openxmlformats.org/drawingml/2006/wordprocessingDrawing" distT="0" distB="0" distL="0" distR="0">
+                <wp:extent cx="5943600" cy="3030617"/>
+                <wp:effectExtent l="0" t="0" r="0" b="0"/>
+                <wp:docPr id="6" name=""/>
+                <wp:cNvGraphicFramePr>
+                  <a:graphicFrameLocks xmlns:a="http://schemas.openxmlformats.org/drawingml/2006/main" noChangeAspect="1"/>
+                </wp:cNvGraphicFramePr>
+                <a:graphic xmlns:a="http://schemas.openxmlformats.org/drawingml/2006/main">
+                  <a:graphicData uri="http://schemas.openxmlformats.org/drawingml/2006/picture">
+                    <pic:pic xmlns:pic="http://schemas.openxmlformats.org/drawingml/2006/picture">
+                      <pic:nvPicPr>
+                        <pic:cNvPr id="289347227" name=""/>
+                        <pic:cNvPicPr>
+                          <a:picLocks noChangeAspect="1"/>
+                        </pic:cNvPicPr>
+                        <pic:nvPr/>
+                      </pic:nvPicPr>
+                      <pic:blipFill rotWithShape="1">
+                        <a:blip r:embed="rId12"/>
+                        <a:stretch/>
+                      </pic:blipFill>
+                      <pic:spPr bwMode="auto">
+                        <a:xfrm>
+                          <a:off x="0" y="0"/>
+                          <a:ext cx="5943599" cy="3030616"/>
+                        </a:xfrm>
+                        <a:prstGeom prst="rect">
+                          <a:avLst/>
+                        </a:prstGeom>
+                      </pic:spPr>
+                    </pic:pic>
+                  </a:graphicData>
+                </a:graphic>
+              </wp:inline>
+            </w:drawing>
+          </mc:Choice>
+          <mc:Fallback>
+            <w:pict>
+              <v:shapetype id="_x0000_t75" coordsize="21600,21600" o:spt="75" o:preferrelative="t" path="m@4@5l@4@11@9@11@9@5xe" filled="f" stroked="f">
+                <v:stroke joinstyle="miter"/>
+                <v:formulas>
+                  <v:f eqn="if lineDrawn pixelLineWidth 0"/>
+                  <v:f eqn="sum @0 1 0"/>
+                  <v:f eqn="sum 0 0 @1"/>
+                  <v:f eqn="prod @2 1 2"/>
+                  <v:f eqn="prod @3 21600 pixelWidth"/>
+                  <v:f eqn="prod @3 21600 pixelHeight"/>
+                  <v:f eqn="sum @0 0 1"/>
+                  <v:f eqn="prod @6 1 2"/>
+                  <v:f eqn="prod @7 21600 pixelWidth"/>
+                  <v:f eqn="sum @8 21600 0"/>
+                  <v:f eqn="prod @7 21600 pixelHeight"/>
+                  <v:f eqn="sum @10 21600 0"/>
+                </v:formulas>
+                <v:path o:extrusionok="f" gradientshapeok="t" o:connecttype="rect"/>
+                <o:lock v:ext="edit" aspectratio="t"/>
+              </v:shapetype>
+              <v:shape id="_x0000_i5" o:spid="_x0000_s5" type="#_x0000_t75" style="width:468.00pt;height:238.63pt;mso-wrap-distance-left:0.00pt;mso-wrap-distance-top:0.00pt;mso-wrap-distance-right:0.00pt;mso-wrap-distance-bottom:0.00pt;z-index:1;" stroked="false">
+                <v:imagedata r:id="rId12" o:title=""/>
+                <o:lock v:ext="edit" rotation="t"/>
+              </v:shape>
+            </w:pict>
+          </mc:Fallback>
+        </mc:AlternateContent>
+      </w:r>
+      <w:r>
+        <w:rPr>
+          <w:highlight w:val="none"/>
+          <w:u w:val="single"/>
+        </w:rPr>
+      </w:r>
+      <w:r>
+        <w:rPr>
+          <w:u w:val="single"/>
+        </w:rPr>
+      </w:r>
+    </w:p>
+    <w:p>
+      <w:pPr>
+        <w:pBdr/>
+        <w:spacing/>
+        <w:ind/>
+        <w:rPr>
+          <w:u w:val="single"/>
+        </w:rPr>
+      </w:pPr>
+      <w:r>
+        <w:rPr>
+          <w:highlight w:val="none"/>
+          <w:u w:val="single"/>
+        </w:rPr>
+      </w:r>
+      <w:r>
+        <w:rPr>
+          <w:highlight w:val="none"/>
+          <w:u w:val="single"/>
+        </w:rPr>
+      </w:r>
+      <w:r>
+        <w:rPr>
+          <w:highlight w:val="none"/>
+          <w:u w:val="single"/>
+        </w:rPr>
+      </w:r>
     </w:p>
     <w:sectPr>
       <w:footnotePr/>

</xml_diff>

<commit_message>
Task 3: useEffect Hook & Lifecycle
Completed.
</commit_message>
<xml_diff>
--- a/Frontend Development/handson_05/handon5.docx
+++ b/Frontend Development/handson_05/handon5.docx
@@ -310,7 +310,11 @@
           </mc:Fallback>
         </mc:AlternateContent>
       </w:r>
-      <w:r/>
+      <w:r>
+        <w:rPr>
+          <w:highlight w:val="none"/>
+        </w:rPr>
+      </w:r>
     </w:p>
     <w:p>
       <w:pPr>
@@ -363,12 +367,12 @@
       </w:r>
       <w:r>
         <w:rPr>
-          <w:highlight w:val="none"/>
           <w:u w:val="single"/>
         </w:rPr>
       </w:r>
       <w:r>
         <w:rPr>
+          <w:highlight w:val="none"/>
           <w:u w:val="single"/>
         </w:rPr>
       </w:r>
@@ -485,18 +489,12 @@
       </w:r>
       <w:r>
         <w:rPr>
-          <w:highlight w:val="none"/>
           <w:u w:val="single"/>
         </w:rPr>
       </w:r>
       <w:r>
         <w:rPr>
           <w:highlight w:val="none"/>
-          <w:u w:val="single"/>
-        </w:rPr>
-      </w:r>
-      <w:r>
-        <w:rPr>
           <w:u w:val="single"/>
         </w:rPr>
       </w:r>
@@ -598,12 +596,6 @@
           <w:u w:val="single"/>
         </w:rPr>
       </w:r>
-      <w:r>
-        <w:rPr>
-          <w:highlight w:val="none"/>
-          <w:u w:val="single"/>
-        </w:rPr>
-      </w:r>
     </w:p>
     <w:p>
       <w:pPr>
@@ -702,29 +694,17 @@
           <w:u w:val="single"/>
         </w:rPr>
       </w:r>
-      <w:r>
+    </w:p>
+    <w:p>
+      <w:pPr>
+        <w:pBdr/>
+        <w:spacing/>
+        <w:ind/>
         <w:rPr>
           <w:highlight w:val="none"/>
           <w:u w:val="single"/>
         </w:rPr>
-      </w:r>
-    </w:p>
-    <w:p>
-      <w:pPr>
-        <w:pBdr/>
-        <w:spacing/>
-        <w:ind/>
-        <w:rPr>
-          <w:highlight w:val="none"/>
-          <w:u w:val="single"/>
-        </w:rPr>
-      </w:pPr>
-      <w:r>
-        <w:rPr>
-          <w:highlight w:val="none"/>
-          <w:u w:val="single"/>
-        </w:rPr>
-      </w:r>
+      </w:pPr>
       <w:r>
         <w:rPr>
           <w:highlight w:val="none"/>
@@ -802,7 +782,32 @@
       </w:r>
       <w:r>
         <w:rPr>
+          <w:u w:val="single"/>
+        </w:rPr>
+      </w:r>
+      <w:r>
+        <w:rPr>
           <w:highlight w:val="none"/>
+          <w:u w:val="single"/>
+        </w:rPr>
+      </w:r>
+    </w:p>
+    <w:p>
+      <w:pPr>
+        <w:pBdr/>
+        <w:spacing/>
+        <w:ind/>
+        <w:rPr>
+          <w:u w:val="single"/>
+        </w:rPr>
+      </w:pPr>
+      <w:r>
+        <w:rPr>
+          <w:u w:val="single"/>
+        </w:rPr>
+      </w:r>
+      <w:r>
+        <w:rPr>
           <w:u w:val="single"/>
         </w:rPr>
       </w:r>
@@ -818,6 +823,168 @@
         <w:spacing/>
         <w:ind/>
         <w:rPr>
+          <w:u w:val="single"/>
+        </w:rPr>
+      </w:pPr>
+      <w:r>
+        <w:rPr>
+          <w:u w:val="single"/>
+        </w:rPr>
+      </w:r>
+      <w:r>
+        <w:rPr>
+          <w:u w:val="single"/>
+        </w:rPr>
+      </w:r>
+      <w:r>
+        <w:rPr>
+          <w:u w:val="single"/>
+        </w:rPr>
+      </w:r>
+    </w:p>
+    <w:p>
+      <w:pPr>
+        <w:pBdr/>
+        <w:spacing/>
+        <w:ind/>
+        <w:rPr>
+          <w:u w:val="single"/>
+        </w:rPr>
+      </w:pPr>
+      <w:r>
+        <w:rPr>
+          <w:u w:val="single"/>
+        </w:rPr>
+      </w:r>
+      <w:r>
+        <w:rPr>
+          <w:u w:val="single"/>
+        </w:rPr>
+      </w:r>
+      <w:r>
+        <w:rPr>
+          <w:u w:val="single"/>
+        </w:rPr>
+      </w:r>
+    </w:p>
+    <w:p>
+      <w:pPr>
+        <w:pBdr/>
+        <w:spacing/>
+        <w:ind/>
+        <w:rPr>
+          <w:u w:val="single"/>
+        </w:rPr>
+      </w:pPr>
+      <w:r>
+        <w:rPr>
+          <w:u w:val="single"/>
+        </w:rPr>
+      </w:r>
+      <w:r>
+        <w:rPr>
+          <w:u w:val="single"/>
+        </w:rPr>
+      </w:r>
+      <w:r>
+        <w:rPr>
+          <w:u w:val="single"/>
+        </w:rPr>
+      </w:r>
+    </w:p>
+    <w:p>
+      <w:pPr>
+        <w:pBdr/>
+        <w:spacing/>
+        <w:ind/>
+        <w:rPr>
+          <w:u w:val="single"/>
+        </w:rPr>
+      </w:pPr>
+      <w:r>
+        <w:rPr>
+          <w:u w:val="single"/>
+        </w:rPr>
+      </w:r>
+      <w:r>
+        <w:rPr>
+          <w:u w:val="single"/>
+        </w:rPr>
+      </w:r>
+      <w:r>
+        <w:rPr>
+          <w:u w:val="single"/>
+        </w:rPr>
+      </w:r>
+    </w:p>
+    <w:p>
+      <w:pPr>
+        <w:pBdr/>
+        <w:spacing/>
+        <w:ind/>
+        <w:rPr>
+          <w:u w:val="single"/>
+        </w:rPr>
+      </w:pPr>
+      <w:r>
+        <w:rPr>
+          <w:u w:val="single"/>
+        </w:rPr>
+      </w:r>
+      <w:r>
+        <w:rPr>
+          <w:u w:val="single"/>
+        </w:rPr>
+      </w:r>
+      <w:r>
+        <w:rPr>
+          <w:u w:val="single"/>
+        </w:rPr>
+      </w:r>
+    </w:p>
+    <w:p>
+      <w:pPr>
+        <w:pBdr/>
+        <w:spacing/>
+        <w:ind/>
+        <w:rPr>
+          <w:highlight w:val="none"/>
+          <w:u w:val="single"/>
+        </w:rPr>
+      </w:pPr>
+      <w:r>
+        <w:rPr>
+          <w:highlight w:val="none"/>
+          <w:u w:val="single"/>
+        </w:rPr>
+      </w:r>
+      <w:r>
+        <w:rPr>
+          <w:highlight w:val="none"/>
+          <w:u w:val="single"/>
+        </w:rPr>
+        <w:t xml:space="preserve">Task 3: useEffect Hook &amp; Lifecycle</w:t>
+      </w:r>
+      <w:r>
+        <w:rPr>
+          <w:highlight w:val="none"/>
+          <w:u w:val="single"/>
+        </w:rPr>
+      </w:r>
+      <w:r>
+        <w:rPr>
+          <w:highlight w:val="none"/>
+          <w:u w:val="single"/>
+        </w:rPr>
+      </w:r>
+    </w:p>
+    <w:p>
+      <w:pPr>
+        <w:pBdr/>
+        <w:spacing/>
+        <w:ind/>
+        <w:rPr>
+          <w:highlight w:val="none"/>
           <w:u w:val="single"/>
         </w:rPr>
       </w:pPr>
@@ -834,8 +1001,179 @@
         </w:rPr>
       </w:r>
       <w:r>
+        <mc:AlternateContent>
+          <mc:Choice Requires="wpg">
+            <w:drawing>
+              <wp:inline xmlns:wp="http://schemas.openxmlformats.org/drawingml/2006/wordprocessingDrawing" distT="0" distB="0" distL="0" distR="0">
+                <wp:extent cx="5943600" cy="2872740"/>
+                <wp:effectExtent l="0" t="0" r="0" b="0"/>
+                <wp:docPr id="7" name=""/>
+                <wp:cNvGraphicFramePr>
+                  <a:graphicFrameLocks xmlns:a="http://schemas.openxmlformats.org/drawingml/2006/main" noChangeAspect="1"/>
+                </wp:cNvGraphicFramePr>
+                <a:graphic xmlns:a="http://schemas.openxmlformats.org/drawingml/2006/main">
+                  <a:graphicData uri="http://schemas.openxmlformats.org/drawingml/2006/picture">
+                    <pic:pic xmlns:pic="http://schemas.openxmlformats.org/drawingml/2006/picture">
+                      <pic:nvPicPr>
+                        <pic:cNvPr id="1608057444" name=""/>
+                        <pic:cNvPicPr>
+                          <a:picLocks noChangeAspect="1"/>
+                        </pic:cNvPicPr>
+                        <pic:nvPr/>
+                      </pic:nvPicPr>
+                      <pic:blipFill rotWithShape="1">
+                        <a:blip r:embed="rId13"/>
+                        <a:stretch/>
+                      </pic:blipFill>
+                      <pic:spPr bwMode="auto">
+                        <a:xfrm>
+                          <a:off x="0" y="0"/>
+                          <a:ext cx="5943599" cy="2872739"/>
+                        </a:xfrm>
+                        <a:prstGeom prst="rect">
+                          <a:avLst/>
+                        </a:prstGeom>
+                      </pic:spPr>
+                    </pic:pic>
+                  </a:graphicData>
+                </a:graphic>
+              </wp:inline>
+            </w:drawing>
+          </mc:Choice>
+          <mc:Fallback>
+            <w:pict>
+              <v:shapetype id="_x0000_t75" coordsize="21600,21600" o:spt="75" o:preferrelative="t" path="m@4@5l@4@11@9@11@9@5xe" filled="f" stroked="f">
+                <v:stroke joinstyle="miter"/>
+                <v:formulas>
+                  <v:f eqn="if lineDrawn pixelLineWidth 0"/>
+                  <v:f eqn="sum @0 1 0"/>
+                  <v:f eqn="sum 0 0 @1"/>
+                  <v:f eqn="prod @2 1 2"/>
+                  <v:f eqn="prod @3 21600 pixelWidth"/>
+                  <v:f eqn="prod @3 21600 pixelHeight"/>
+                  <v:f eqn="sum @0 0 1"/>
+                  <v:f eqn="prod @6 1 2"/>
+                  <v:f eqn="prod @7 21600 pixelWidth"/>
+                  <v:f eqn="sum @8 21600 0"/>
+                  <v:f eqn="prod @7 21600 pixelHeight"/>
+                  <v:f eqn="sum @10 21600 0"/>
+                </v:formulas>
+                <v:path o:extrusionok="f" gradientshapeok="t" o:connecttype="rect"/>
+                <o:lock v:ext="edit" aspectratio="t"/>
+              </v:shapetype>
+              <v:shape id="_x0000_i6" o:spid="_x0000_s6" type="#_x0000_t75" style="width:468.00pt;height:226.20pt;mso-wrap-distance-left:0.00pt;mso-wrap-distance-top:0.00pt;mso-wrap-distance-right:0.00pt;mso-wrap-distance-bottom:0.00pt;z-index:1;" stroked="false">
+                <v:imagedata r:id="rId13" o:title=""/>
+                <o:lock v:ext="edit" rotation="t"/>
+              </v:shape>
+            </w:pict>
+          </mc:Fallback>
+        </mc:AlternateContent>
+      </w:r>
+      <w:r>
         <w:rPr>
           <w:highlight w:val="none"/>
+          <w:u w:val="single"/>
+        </w:rPr>
+      </w:r>
+      <w:r>
+        <w:rPr>
+          <w:highlight w:val="none"/>
+          <w:u w:val="single"/>
+        </w:rPr>
+      </w:r>
+    </w:p>
+    <w:p>
+      <w:pPr>
+        <w:pBdr/>
+        <w:spacing/>
+        <w:ind/>
+        <w:rPr>
+          <w:u w:val="single"/>
+        </w:rPr>
+      </w:pPr>
+      <w:r>
+        <w:rPr>
+          <w:highlight w:val="none"/>
+          <w:u w:val="single"/>
+        </w:rPr>
+      </w:r>
+      <w:r>
+        <mc:AlternateContent>
+          <mc:Choice Requires="wpg">
+            <w:drawing>
+              <wp:inline xmlns:wp="http://schemas.openxmlformats.org/drawingml/2006/wordprocessingDrawing" distT="0" distB="0" distL="0" distR="0">
+                <wp:extent cx="5943600" cy="2872740"/>
+                <wp:effectExtent l="0" t="0" r="0" b="0"/>
+                <wp:docPr id="8" name=""/>
+                <wp:cNvGraphicFramePr>
+                  <a:graphicFrameLocks xmlns:a="http://schemas.openxmlformats.org/drawingml/2006/main" noChangeAspect="1"/>
+                </wp:cNvGraphicFramePr>
+                <a:graphic xmlns:a="http://schemas.openxmlformats.org/drawingml/2006/main">
+                  <a:graphicData uri="http://schemas.openxmlformats.org/drawingml/2006/picture">
+                    <pic:pic xmlns:pic="http://schemas.openxmlformats.org/drawingml/2006/picture">
+                      <pic:nvPicPr>
+                        <pic:cNvPr id="2118255411" name=""/>
+                        <pic:cNvPicPr>
+                          <a:picLocks noChangeAspect="1"/>
+                        </pic:cNvPicPr>
+                        <pic:nvPr/>
+                      </pic:nvPicPr>
+                      <pic:blipFill rotWithShape="1">
+                        <a:blip r:embed="rId14"/>
+                        <a:stretch/>
+                      </pic:blipFill>
+                      <pic:spPr bwMode="auto">
+                        <a:xfrm>
+                          <a:off x="0" y="0"/>
+                          <a:ext cx="5943599" cy="2872739"/>
+                        </a:xfrm>
+                        <a:prstGeom prst="rect">
+                          <a:avLst/>
+                        </a:prstGeom>
+                      </pic:spPr>
+                    </pic:pic>
+                  </a:graphicData>
+                </a:graphic>
+              </wp:inline>
+            </w:drawing>
+          </mc:Choice>
+          <mc:Fallback>
+            <w:pict>
+              <v:shapetype id="_x0000_t75" coordsize="21600,21600" o:spt="75" o:preferrelative="t" path="m@4@5l@4@11@9@11@9@5xe" filled="f" stroked="f">
+                <v:stroke joinstyle="miter"/>
+                <v:formulas>
+                  <v:f eqn="if lineDrawn pixelLineWidth 0"/>
+                  <v:f eqn="sum @0 1 0"/>
+                  <v:f eqn="sum 0 0 @1"/>
+                  <v:f eqn="prod @2 1 2"/>
+                  <v:f eqn="prod @3 21600 pixelWidth"/>
+                  <v:f eqn="prod @3 21600 pixelHeight"/>
+                  <v:f eqn="sum @0 0 1"/>
+                  <v:f eqn="prod @6 1 2"/>
+                  <v:f eqn="prod @7 21600 pixelWidth"/>
+                  <v:f eqn="sum @8 21600 0"/>
+                  <v:f eqn="prod @7 21600 pixelHeight"/>
+                  <v:f eqn="sum @10 21600 0"/>
+                </v:formulas>
+                <v:path o:extrusionok="f" gradientshapeok="t" o:connecttype="rect"/>
+                <o:lock v:ext="edit" aspectratio="t"/>
+              </v:shapetype>
+              <v:shape id="_x0000_i7" o:spid="_x0000_s7" type="#_x0000_t75" style="width:468.00pt;height:226.20pt;mso-wrap-distance-left:0.00pt;mso-wrap-distance-top:0.00pt;mso-wrap-distance-right:0.00pt;mso-wrap-distance-bottom:0.00pt;z-index:1;" stroked="false">
+                <v:imagedata r:id="rId14" o:title=""/>
+                <o:lock v:ext="edit" rotation="t"/>
+              </v:shape>
+            </w:pict>
+          </mc:Fallback>
+        </mc:AlternateContent>
+      </w:r>
+      <w:r>
+        <w:rPr>
+          <w:highlight w:val="none"/>
+          <w:u w:val="single"/>
+        </w:rPr>
+      </w:r>
+      <w:r>
+        <w:rPr>
           <w:u w:val="single"/>
         </w:rPr>
       </w:r>

</xml_diff>